<commit_message>
Fix Word question import docx path handling
</commit_message>
<xml_diff>
--- a/question-word-template.docx
+++ b/question-word-template.docx
@@ -1,19 +1,5 @@
 
-<file path=docProps\app.xml><?xml version="1.0" encoding="utf-8"?>
-<Properties xmlns="http://schemas.openxmlformats.org/officeDocument/2006/extended-properties" xmlns:vt="http://schemas.openxmlformats.org/officeDocument/2006/docPropsVTypes">
-  <Application>MindUp</Application>
-</Properties>
-</file>
-
-<file path=docProps\core.xml><?xml version="1.0" encoding="utf-8"?>
-<cp:coreProperties xmlns:cp="http://schemas.openxmlformats.org/package/2006/metadata/core-properties" xmlns:dc="http://purl.org/dc/elements/1.1/" xmlns:dcterms="http://purl.org/dc/terms/" xmlns:dcmitype="http://purl.org/dc/dcmitype/" xmlns:xsi="http://www.w3.org/2001/XMLSchema-instance">
-  <dc:title>MindUp - Mau nhap cau hoi tu Word</dc:title>
-  <dc:creator>MindUp</dc:creator>
-  <cp:lastModifiedBy>MindUp</cp:lastModifiedBy>
-</cp:coreProperties>
-</file>
-
-<file path=word\document.xml><?xml version="1.0" encoding="utf-8"?>
+<file path=word/document.xml><?xml version="1.0" encoding="utf-8"?>
 <w:document xmlns:w="http://schemas.openxmlformats.org/wordprocessingml/2006/main">
   <w:body>
     <w:p>

</xml_diff>